<commit_message>
Worksheets: site location box + QR code to the topic row; catalog topic anchors
Co-Authored-By: Claude Opus 5.5 <noreply@anthropic.com>
Claude-Session: https://claude.ai/code/session_01AhWt76aQYnK2GHBZTwEpVE
</commit_message>
<xml_diff>
--- a/tayarut/coastal/01/worksheet.docx
+++ b/tayarut/coastal/01/worksheet.docx
@@ -95,35 +95,166 @@
         <w:t>המורה מציג את המצגת, ואתם ממלאים כאן את מה שחשוב בכל שקף. בסוף הדף יש שאלות תרגול ובגרות.</w:t>
       </w:r>
     </w:p>
+    <w:tbl>
+      <w:tblPr>
+        <w:bidiVisual/>
+        <w:tblW w:type="auto" w:w="0"/>
+        <w:tblBorders>
+          <w:top w:val="single" w:sz="4" w:color="999999"/>
+          <w:left w:val="nil"/>
+          <w:bottom w:val="single" w:sz="4" w:color="999999"/>
+          <w:right w:val="nil"/>
+          <w:insideH w:val="nil"/>
+          <w:insideV w:val="nil"/>
+        </w:tblBorders>
+        <w:tblLayout w:type="fixed"/>
+        <w:tblLayout w:type="fixed"/>
+        <w:tblLook w:firstColumn="1" w:firstRow="1" w:lastColumn="0" w:lastRow="0" w:noHBand="0" w:noVBand="1" w:val="04A0"/>
+      </w:tblPr>
+      <w:tblGrid>
+        <w:gridCol w:w="7710"/>
+        <w:gridCol w:w="2154"/>
+      </w:tblGrid>
+      <w:tr>
+        <w:tc>
+          <w:tcPr>
+            <w:tcW w:type="dxa" w:w="7710"/>
+          </w:tcPr>
+          <w:p>
+            <w:pPr>
+              <w:bidi/>
+            </w:pPr>
+            <w:r>
+              <w:rPr>
+                <w:rFonts w:ascii="Arial" w:hAnsi="Arial" w:cs="Arial" w:eastAsia="Arial"/>
+                <w:b/>
+                <w:bCs/>
+                <w:i w:val="0"/>
+                <w:sz w:val="22"/>
+                <w:szCs w:val="22"/>
+                <w:rtl/>
+              </w:rPr>
+              <w:t>החומר של הנושא באתר המגמה</w:t>
+            </w:r>
+          </w:p>
+          <w:p>
+            <w:pPr>
+              <w:bidi/>
+            </w:pPr>
+            <w:r>
+              <w:rPr>
+                <w:rFonts w:ascii="Arial" w:hAnsi="Arial" w:cs="Arial" w:eastAsia="Arial"/>
+                <w:b w:val="0"/>
+                <w:i w:val="0"/>
+                <w:sz w:val="20"/>
+                <w:szCs w:val="20"/>
+                <w:rtl/>
+              </w:rPr>
+              <w:t>באתר המגמה, בחבל מישור החוף, נושא 1: עכו והגליל המערבי.</w:t>
+            </w:r>
+          </w:p>
+          <w:p>
+            <w:pPr>
+              <w:bidi/>
+            </w:pPr>
+            <w:r>
+              <w:rPr>
+                <w:rFonts w:ascii="Arial" w:hAnsi="Arial" w:cs="Arial" w:eastAsia="Arial"/>
+                <w:b w:val="0"/>
+                <w:i w:val="0"/>
+                <w:sz w:val="20"/>
+                <w:szCs w:val="20"/>
+                <w:rtl/>
+              </w:rPr>
+              <w:t>בשורה של הנושא יש קישורים למצגת, לסרטון הפתיחה, לפודקאסט החזרה ולדף העבודה הזה.</w:t>
+            </w:r>
+          </w:p>
+          <w:p>
+            <w:pPr>
+              <w:bidi/>
+            </w:pPr>
+            <w:r>
+              <w:rPr>
+                <w:rFonts w:ascii="Arial" w:hAnsi="Arial" w:cs="Arial" w:eastAsia="Arial"/>
+                <w:b w:val="0"/>
+                <w:i w:val="0"/>
+                <w:sz w:val="20"/>
+                <w:szCs w:val="20"/>
+                <w:rtl/>
+              </w:rPr>
+              <w:t>סרקו את הברקוד בטלפון, או הקלידו את הכתובת:</w:t>
+            </w:r>
+          </w:p>
+          <w:p>
+            <w:pPr>
+              <w:bidi/>
+            </w:pPr>
+            <w:r>
+              <w:rPr>
+                <w:rFonts w:ascii="Arial" w:hAnsi="Arial" w:cs="Arial" w:eastAsia="Arial"/>
+                <w:b w:val="0"/>
+                <w:i w:val="0"/>
+                <w:color w:val="555555"/>
+                <w:sz w:val="20"/>
+                <w:szCs w:val="20"/>
+                <w:rtl/>
+              </w:rPr>
+              <w:t>‪nisan1234-afk.github.io/tayarut/#coastal-01‬</w:t>
+            </w:r>
+          </w:p>
+        </w:tc>
+        <w:tc>
+          <w:tcPr>
+            <w:tcW w:type="dxa" w:w="2154"/>
+          </w:tcPr>
+          <w:p>
+            <w:pPr>
+              <w:bidi/>
+              <w:jc w:val="center"/>
+            </w:pPr>
+            <w:r>
+              <w:drawing>
+                <wp:inline xmlns:a="http://schemas.openxmlformats.org/drawingml/2006/main" xmlns:pic="http://schemas.openxmlformats.org/drawingml/2006/picture">
+                  <wp:extent cx="1080000" cy="1080000"/>
+                  <wp:docPr id="1" name="Picture 1"/>
+                  <wp:cNvGraphicFramePr>
+                    <a:graphicFrameLocks noChangeAspect="1"/>
+                  </wp:cNvGraphicFramePr>
+                  <a:graphic>
+                    <a:graphicData uri="http://schemas.openxmlformats.org/drawingml/2006/picture">
+                      <pic:pic>
+                        <pic:nvPicPr>
+                          <pic:cNvPr id="0" name="qr.png"/>
+                          <pic:cNvPicPr/>
+                        </pic:nvPicPr>
+                        <pic:blipFill>
+                          <a:blip r:embed="rId9"/>
+                          <a:stretch>
+                            <a:fillRect/>
+                          </a:stretch>
+                        </pic:blipFill>
+                        <pic:spPr>
+                          <a:xfrm>
+                            <a:off x="0" y="0"/>
+                            <a:ext cx="1080000" cy="1080000"/>
+                          </a:xfrm>
+                          <a:prstGeom prst="rect"/>
+                        </pic:spPr>
+                      </pic:pic>
+                    </a:graphicData>
+                  </a:graphic>
+                </wp:inline>
+              </w:drawing>
+            </w:r>
+          </w:p>
+        </w:tc>
+      </w:tr>
+    </w:tbl>
     <w:p>
       <w:pPr>
         <w:bidi/>
-        <w:spacing w:before="0" w:after="240"/>
+        <w:spacing w:before="0" w:after="160"/>
       </w:pPr>
-      <w:r>
-        <w:rPr>
-          <w:rFonts w:ascii="Arial" w:hAnsi="Arial" w:cs="Arial" w:eastAsia="Arial"/>
-          <w:b w:val="0"/>
-          <w:i w:val="0"/>
-          <w:color w:val="555555"/>
-          <w:sz w:val="18"/>
-          <w:szCs w:val="18"/>
-          <w:rtl/>
-        </w:rPr>
-        <w:t xml:space="preserve">המצגת, הסרטון והפודקאסט באתר: </w:t>
-      </w:r>
-      <w:r>
-        <w:rPr>
-          <w:rFonts w:ascii="Arial" w:hAnsi="Arial" w:cs="Arial" w:eastAsia="Arial"/>
-          <w:b w:val="0"/>
-          <w:i w:val="0"/>
-          <w:color w:val="555555"/>
-          <w:sz w:val="18"/>
-          <w:szCs w:val="18"/>
-          <w:rtl/>
-        </w:rPr>
-        <w:t>‪nisan1234-afk.github.io/tayarut/coastal/01/‬</w:t>
-      </w:r>
     </w:p>
     <w:p>
       <w:pPr>
@@ -204,7 +335,7 @@
         <w:drawing>
           <wp:inline xmlns:a="http://schemas.openxmlformats.org/drawingml/2006/main" xmlns:pic="http://schemas.openxmlformats.org/drawingml/2006/picture">
             <wp:extent cx="3622666" cy="3959999"/>
-            <wp:docPr id="1" name="Picture 1"/>
+            <wp:docPr id="2" name="Picture 2"/>
             <wp:cNvGraphicFramePr>
               <a:graphicFrameLocks noChangeAspect="1"/>
             </wp:cNvGraphicFramePr>
@@ -216,7 +347,7 @@
                     <pic:cNvPicPr/>
                   </pic:nvPicPr>
                   <pic:blipFill>
-                    <a:blip r:embed="rId9"/>
+                    <a:blip r:embed="rId10"/>
                     <a:stretch>
                       <a:fillRect/>
                     </a:stretch>
@@ -4203,7 +4334,7 @@
       </w:pPr>
     </w:p>
     <w:sectPr>
-      <w:footerReference w:type="default" r:id="rId10"/>
+      <w:footerReference w:type="default" r:id="rId11"/>
       <w:pgSz w:w="11906" w:h="16838"/>
       <w:pgMar w:top="907" w:right="1020" w:bottom="907" w:left="1020" w:header="720" w:footer="720" w:gutter="0"/>
       <w:cols w:space="720"/>

</xml_diff>

<commit_message>
Worksheets: QR centered under the text (mobile-friendly)
Co-Authored-By: Claude Opus 5.5 <noreply@anthropic.com>
Claude-Session: https://claude.ai/code/session_01AhWt76aQYnK2GHBZTwEpVE
</commit_message>
<xml_diff>
--- a/tayarut/coastal/01/worksheet.docx
+++ b/tayarut/coastal/01/worksheet.docx
@@ -112,13 +112,12 @@
         <w:tblLook w:firstColumn="1" w:firstRow="1" w:lastColumn="0" w:lastRow="0" w:noHBand="0" w:noVBand="1" w:val="04A0"/>
       </w:tblPr>
       <w:tblGrid>
-        <w:gridCol w:w="7710"/>
-        <w:gridCol w:w="2154"/>
+        <w:gridCol w:w="9865"/>
       </w:tblGrid>
       <w:tr>
         <w:tc>
           <w:tcPr>
-            <w:tcW w:type="dxa" w:w="7710"/>
+            <w:tcW w:type="dxa" w:w="9865"/>
           </w:tcPr>
           <w:p>
             <w:pPr>
@@ -202,11 +201,6 @@
               <w:t>‪nisan1234-afk.github.io/tayarut/#coastal-01‬</w:t>
             </w:r>
           </w:p>
-        </w:tc>
-        <w:tc>
-          <w:tcPr>
-            <w:tcW w:type="dxa" w:w="2154"/>
-          </w:tcPr>
           <w:p>
             <w:pPr>
               <w:bidi/>

</xml_diff>